<commit_message>
Reescreve a Estratégia do Checkpoint 2 com tom mais natural
</commit_message>
<xml_diff>
--- a/garantia-qualidade-software/a3/checkpoint-2/Checkpoint2_A3_SpringPetclinic.docx
+++ b/garantia-qualidade-software/a3/checkpoint-2/Checkpoint2_A3_SpringPetclinic.docx
@@ -352,7 +352,19 @@
           <w:b w:val="0"/>
           <w:sz w:val="22"/>
         </w:rPr>
-        <w:t>Exploração dos usuários e da interface, com foco na validação dos formulários.</w:t>
+        <w:t>Testamos os formulários de cadastro na tela mesmo, colocando dado certo e dado errado pra ver o que o sistema deixava passar (teste caixa-preta, sem mexer no código).</w:t>
+      </w:r>
+    </w:p>
+    <w:p>
+      <w:pPr>
+        <w:ind w:left="576"/>
+      </w:pPr>
+      <w:r>
+        <w:rPr>
+          <w:b w:val="0"/>
+          <w:sz w:val="22"/>
+        </w:rPr>
+        <w:t>Também mandamos as mesmas requisições direto pela API REST usando o Postman, pra conferir se a validação era feita só na tela ou se valia pro sistema todo.</w:t>
       </w:r>
     </w:p>
     <w:p/>

</xml_diff>

<commit_message>
Insere as evidências (prints) dentro do documento do Checkpoint 2
</commit_message>
<xml_diff>
--- a/garantia-qualidade-software/a3/checkpoint-2/Checkpoint2_A3_SpringPetclinic.docx
+++ b/garantia-qualidade-software/a3/checkpoint-2/Checkpoint2_A3_SpringPetclinic.docx
@@ -1332,7 +1332,228 @@
           <w:b/>
           <w:sz w:val="22"/>
         </w:rPr>
-        <w:t xml:space="preserve">6. </w:t>
+        <w:t>6. Evidências</w:t>
+      </w:r>
+    </w:p>
+    <w:p>
+      <w:pPr>
+        <w:ind w:left="576"/>
+      </w:pPr>
+      <w:r>
+        <w:drawing>
+          <wp:inline xmlns:a="http://schemas.openxmlformats.org/drawingml/2006/main" xmlns:pic="http://schemas.openxmlformats.org/drawingml/2006/picture">
+            <wp:extent cx="4937760" cy="2765839"/>
+            <wp:docPr id="1" name="Picture 1"/>
+            <wp:cNvGraphicFramePr>
+              <a:graphicFrameLocks noChangeAspect="1"/>
+            </wp:cNvGraphicFramePr>
+            <a:graphic>
+              <a:graphicData uri="http://schemas.openxmlformats.org/drawingml/2006/picture">
+                <pic:pic>
+                  <pic:nvPicPr>
+                    <pic:cNvPr id="0" name="specialties-cirurgiao-duplicado.jpg"/>
+                    <pic:cNvPicPr/>
+                  </pic:nvPicPr>
+                  <pic:blipFill>
+                    <a:blip r:embed="rId11"/>
+                    <a:stretch>
+                      <a:fillRect/>
+                    </a:stretch>
+                  </pic:blipFill>
+                  <pic:spPr>
+                    <a:xfrm>
+                      <a:off x="0" y="0"/>
+                      <a:ext cx="4937760" cy="2765839"/>
+                    </a:xfrm>
+                    <a:prstGeom prst="rect"/>
+                  </pic:spPr>
+                </pic:pic>
+              </a:graphicData>
+            </a:graphic>
+          </wp:inline>
+        </w:drawing>
+      </w:r>
+    </w:p>
+    <w:p>
+      <w:pPr>
+        <w:ind w:left="576"/>
+      </w:pPr>
+      <w:r>
+        <w:rPr>
+          <w:i/>
+          <w:color w:val="595959"/>
+          <w:sz w:val="19"/>
+        </w:rPr>
+        <w:t>Tela "Specialties": "cirurgião" cadastrado duas vezes — confirma a duplicação de disciplinas/especialidades.</w:t>
+      </w:r>
+    </w:p>
+    <w:p/>
+    <w:p>
+      <w:pPr>
+        <w:ind w:left="576"/>
+      </w:pPr>
+      <w:r>
+        <w:drawing>
+          <wp:inline xmlns:a="http://schemas.openxmlformats.org/drawingml/2006/main" xmlns:pic="http://schemas.openxmlformats.org/drawingml/2006/picture">
+            <wp:extent cx="4937760" cy="3666471"/>
+            <wp:docPr id="2" name="Picture 2"/>
+            <wp:cNvGraphicFramePr>
+              <a:graphicFrameLocks noChangeAspect="1"/>
+            </wp:cNvGraphicFramePr>
+            <a:graphic>
+              <a:graphicData uri="http://schemas.openxmlformats.org/drawingml/2006/picture">
+                <pic:pic>
+                  <pic:nvPicPr>
+                    <pic:cNvPr id="0" name="veterinarians-ian-furtado-duplicado.jpg"/>
+                    <pic:cNvPicPr/>
+                  </pic:nvPicPr>
+                  <pic:blipFill>
+                    <a:blip r:embed="rId12"/>
+                    <a:stretch>
+                      <a:fillRect/>
+                    </a:stretch>
+                  </pic:blipFill>
+                  <pic:spPr>
+                    <a:xfrm>
+                      <a:off x="0" y="0"/>
+                      <a:ext cx="4937760" cy="3666471"/>
+                    </a:xfrm>
+                    <a:prstGeom prst="rect"/>
+                  </pic:spPr>
+                </pic:pic>
+              </a:graphicData>
+            </a:graphic>
+          </wp:inline>
+        </w:drawing>
+      </w:r>
+    </w:p>
+    <w:p>
+      <w:pPr>
+        <w:ind w:left="576"/>
+      </w:pPr>
+      <w:r>
+        <w:rPr>
+          <w:i/>
+          <w:color w:val="595959"/>
+          <w:sz w:val="19"/>
+        </w:rPr>
+        <w:t>Tela "Veterinarians": "ian furtado" cadastrado duas vezes com a mesma especialidade — confirma a duplicação de veterinários.</w:t>
+      </w:r>
+    </w:p>
+    <w:p/>
+    <w:p>
+      <w:pPr>
+        <w:ind w:left="576"/>
+      </w:pPr>
+      <w:r>
+        <w:drawing>
+          <wp:inline xmlns:a="http://schemas.openxmlformats.org/drawingml/2006/main" xmlns:pic="http://schemas.openxmlformats.org/drawingml/2006/picture">
+            <wp:extent cx="4937760" cy="3346857"/>
+            <wp:docPr id="3" name="Picture 3"/>
+            <wp:cNvGraphicFramePr>
+              <a:graphicFrameLocks noChangeAspect="1"/>
+            </wp:cNvGraphicFramePr>
+            <a:graphic>
+              <a:graphicData uri="http://schemas.openxmlformats.org/drawingml/2006/picture">
+                <pic:pic>
+                  <pic:nvPicPr>
+                    <pic:cNvPr id="0" name="pet-types-snake-duplicado-e-numerico.jpg"/>
+                    <pic:cNvPicPr/>
+                  </pic:nvPicPr>
+                  <pic:blipFill>
+                    <a:blip r:embed="rId13"/>
+                    <a:stretch>
+                      <a:fillRect/>
+                    </a:stretch>
+                  </pic:blipFill>
+                  <pic:spPr>
+                    <a:xfrm>
+                      <a:off x="0" y="0"/>
+                      <a:ext cx="4937760" cy="3346857"/>
+                    </a:xfrm>
+                    <a:prstGeom prst="rect"/>
+                  </pic:spPr>
+                </pic:pic>
+              </a:graphicData>
+            </a:graphic>
+          </wp:inline>
+        </w:drawing>
+      </w:r>
+    </w:p>
+    <w:p>
+      <w:pPr>
+        <w:ind w:left="576"/>
+      </w:pPr>
+      <w:r>
+        <w:rPr>
+          <w:i/>
+          <w:color w:val="595959"/>
+          <w:sz w:val="19"/>
+        </w:rPr>
+        <w:t>Tela "Pet Types": "snake" duplicado e "snake 123" com número no nome — confirma a duplicação e a aceitação de caractere numérico.</w:t>
+      </w:r>
+    </w:p>
+    <w:p/>
+    <w:p>
+      <w:pPr>
+        <w:ind w:left="576"/>
+      </w:pPr>
+      <w:r>
+        <w:drawing>
+          <wp:inline xmlns:a="http://schemas.openxmlformats.org/drawingml/2006/main" xmlns:pic="http://schemas.openxmlformats.org/drawingml/2006/picture">
+            <wp:extent cx="4937760" cy="3017735"/>
+            <wp:docPr id="4" name="Picture 4"/>
+            <wp:cNvGraphicFramePr>
+              <a:graphicFrameLocks noChangeAspect="1"/>
+            </wp:cNvGraphicFramePr>
+            <a:graphic>
+              <a:graphicData uri="http://schemas.openxmlformats.org/drawingml/2006/picture">
+                <pic:pic>
+                  <pic:nvPicPr>
+                    <pic:cNvPr id="0" name="terminal-sistema-rodando-docker-angular.jpg"/>
+                    <pic:cNvPicPr/>
+                  </pic:nvPicPr>
+                  <pic:blipFill>
+                    <a:blip r:embed="rId14"/>
+                    <a:stretch>
+                      <a:fillRect/>
+                    </a:stretch>
+                  </pic:blipFill>
+                  <pic:spPr>
+                    <a:xfrm>
+                      <a:off x="0" y="0"/>
+                      <a:ext cx="4937760" cy="3017735"/>
+                    </a:xfrm>
+                    <a:prstGeom prst="rect"/>
+                  </pic:spPr>
+                </pic:pic>
+              </a:graphicData>
+            </a:graphic>
+          </wp:inline>
+        </w:drawing>
+      </w:r>
+    </w:p>
+    <w:p>
+      <w:pPr>
+        <w:ind w:left="576"/>
+      </w:pPr>
+      <w:r>
+        <w:rPr>
+          <w:i/>
+          <w:color w:val="595959"/>
+          <w:sz w:val="19"/>
+        </w:rPr>
+        <w:t>Terminal com o Angular (ng serve) e o backend Spring Boot rodando via Docker na porta 9966 — evidência do ambiente configurado no Checkpoint 1.</w:t>
+      </w:r>
+    </w:p>
+    <w:p/>
+    <w:p>
+      <w:r>
+        <w:rPr>
+          <w:b/>
+          <w:sz w:val="22"/>
+        </w:rPr>
+        <w:t xml:space="preserve">7. </w:t>
       </w:r>
       <w:r>
         <w:rPr>
@@ -1412,7 +1633,7 @@
               <w:drawing>
                 <wp:inline xmlns:a="http://schemas.openxmlformats.org/drawingml/2006/main" xmlns:pic="http://schemas.openxmlformats.org/drawingml/2006/picture">
                   <wp:extent cx="1554480" cy="327019"/>
-                  <wp:docPr id="1" name="Picture 1"/>
+                  <wp:docPr id="5" name="Picture 5"/>
                   <wp:cNvGraphicFramePr>
                     <a:graphicFrameLocks noChangeAspect="1"/>
                   </wp:cNvGraphicFramePr>
@@ -1424,7 +1645,7 @@
                           <pic:cNvPicPr/>
                         </pic:nvPicPr>
                         <pic:blipFill>
-                          <a:blip r:embed="rId11"/>
+                          <a:blip r:embed="rId15"/>
                           <a:stretch>
                             <a:fillRect/>
                           </a:stretch>
@@ -1456,7 +1677,7 @@
               <w:drawing>
                 <wp:inline xmlns:a="http://schemas.openxmlformats.org/drawingml/2006/main" xmlns:pic="http://schemas.openxmlformats.org/drawingml/2006/picture">
                   <wp:extent cx="914400" cy="416052"/>
-                  <wp:docPr id="2" name="Picture 2"/>
+                  <wp:docPr id="6" name="Picture 6"/>
                   <wp:cNvGraphicFramePr>
                     <a:graphicFrameLocks noChangeAspect="1"/>
                   </wp:cNvGraphicFramePr>
@@ -1468,7 +1689,7 @@
                           <pic:cNvPicPr/>
                         </pic:nvPicPr>
                         <pic:blipFill>
-                          <a:blip r:embed="rId12"/>
+                          <a:blip r:embed="rId16"/>
                           <a:stretch>
                             <a:fillRect/>
                           </a:stretch>

</xml_diff>